<commit_message>
Adapt letters to institution type (public INSPE vs Catholic ISFEC)
- INSPEs (Aix-Marseille, Lyon): replace Catholic/small-class references
  with academic quality, theory-practice balance, CRPE preparation focus
- ISFEC Bretagne: keep and reinforce Catholic values, human-scale promotion,
  and personalized support; closing paragraph now explicitly names these values

https://claude.ai/code/session_013kjcWtepvPDM8nG7S6zxrn
</commit_message>
<xml_diff>
--- a/lettre_INSPE_AixMarseille_Aix.docx
+++ b/lettre_INSPE_AixMarseille_Aix.docx
@@ -183,7 +183,7 @@
           <w:rFonts w:ascii="Times New Roman" w:hAnsi="Times New Roman"/>
           <w:sz w:val="24"/>
         </w:rPr>
-        <w:t>C'est une vocation pour l'enseignement, mûrie au fil des années, qui me pousse aujourd'hui à présenter ma candidature au Master M2E que vous proposez. Ce n'est pas un choix par défaut : votre établissement est celui dans lequel je me projette pleinement. La taille humaine des promotions, l'accompagnement individualisé et l'ancrage dans les valeurs de l'enseignement catholique correspondent à la vision de l'éducation que je porte depuis plusieurs années. C'est dans ce cadre, exigeant et bienveillant, que je souhaite préparer le CRPE et construire mon avenir dans l'enseignement du premier degré.</w:t>
+        <w:t>C'est une vocation pour l'enseignement, mûrie au fil des années, qui me pousse aujourd'hui à présenter ma candidature au Master M2E que vous proposez. Ce n'est pas un choix par défaut : l'INSPE d'Aix-Marseille est un établissement dans lequel je me projette pleinement. La qualité de la formation, l'articulation entre théorie et pratique professionnelle, et la rigueur de la préparation au CRPE correspondent aux exigences que je me fixe. C'est dans ce cadre académique solide que je souhaite préparer le concours et construire mon avenir dans l'enseignement du premier degré.</w:t>
       </w:r>
     </w:p>
     <w:p>
@@ -239,7 +239,7 @@
           <w:rFonts w:ascii="Times New Roman" w:hAnsi="Times New Roman"/>
           <w:sz w:val="24"/>
         </w:rPr>
-        <w:t>Je suis profondément attachée à l'idée que l'enseignement ne se réduit pas à la transmission de savoirs : il s'agit d'accompagner chaque élève dans son développement, avec attention et exigence. C'est cette conviction qui me pousse à candidater en priorité à l'INSPE d'Aix-Marseille (site d'Aix-en-Provence), un établissement dont les valeurs correspondent à ce que je veux incarner en tant qu'enseignante. Je suis déterminée à m'investir pleinement dans cette formation.</w:t>
+        <w:t>Je suis profondément attachée à l'idée que l'enseignement ne se réduit pas à la transmission de savoirs : il s'agit d'accompagner chaque élève dans son développement, avec attention et exigence. C'est cette conviction qui me pousse à candidater à l'INSPE d'Aix-Marseille, dont la réputation et les ressources pédagogiques correspondent au niveau d'engagement que je veux apporter à cette formation. Je suis déterminée à m'investir pleinement pour réussir le CRPE et devenir professeure des écoles.</w:t>
       </w:r>
     </w:p>
     <w:p>

</xml_diff>